<commit_message>
System Requirements and System Design summary is explained in Report
</commit_message>
<xml_diff>
--- a/FLC_FinalReport.docx
+++ b/FLC_FinalReport.docx
@@ -41,21 +41,31 @@
     <w:p>
       <w:pPr>
         <w:pStyle w:val="NormalWeb"/>
-        <w:numPr>
-          <w:ilvl w:val="0"/>
-          <w:numId w:val="1"/>
-        </w:numPr>
         <w:rPr>
           <w:rFonts w:ascii="Calibri" w:eastAsiaTheme="majorEastAsia" w:hAnsi="Calibri" w:cs="Calibri"/>
           <w:color w:val="2F5496" w:themeColor="accent1" w:themeShade="BF"/>
           <w:lang w:val="en-GB"/>
         </w:rPr>
       </w:pPr>
-      <w:r>
-        <w:rPr>
-          <w:rFonts w:ascii="Calibri" w:hAnsi="Calibri" w:cs="Calibri"/>
-        </w:rPr>
-        <w:t>System Requirements</w:t>
+      <w:proofErr w:type="gramStart"/>
+      <w:r>
+        <w:rPr>
+          <w:rFonts w:ascii="Calibri" w:hAnsi="Calibri" w:cs="Calibri"/>
+        </w:rPr>
+        <w:t>1.</w:t>
+      </w:r>
+      <w:r>
+        <w:rPr>
+          <w:rFonts w:ascii="Calibri" w:hAnsi="Calibri" w:cs="Calibri"/>
+        </w:rPr>
+        <w:t>System</w:t>
+      </w:r>
+      <w:proofErr w:type="gramEnd"/>
+      <w:r>
+        <w:rPr>
+          <w:rFonts w:ascii="Calibri" w:hAnsi="Calibri" w:cs="Calibri"/>
+        </w:rPr>
+        <w:t xml:space="preserve"> Requirements</w:t>
       </w:r>
     </w:p>
     <w:p>
@@ -125,6 +135,410 @@
       </w:pPr>
     </w:p>
     <w:p>
+      <w:pPr>
+        <w:pStyle w:val="Heading1"/>
+        <w:rPr>
+          <w:rFonts w:ascii="Calibri" w:hAnsi="Calibri" w:cs="Calibri"/>
+          <w:sz w:val="24"/>
+          <w:szCs w:val="24"/>
+        </w:rPr>
+      </w:pPr>
+      <w:r>
+        <w:rPr>
+          <w:rFonts w:ascii="Calibri" w:hAnsi="Calibri" w:cs="Calibri"/>
+          <w:sz w:val="24"/>
+          <w:szCs w:val="24"/>
+        </w:rPr>
+        <w:t>2. System Requirements</w:t>
+      </w:r>
+    </w:p>
+    <w:p>
+      <w:pPr>
+        <w:pStyle w:val="NormalWeb"/>
+        <w:rPr>
+          <w:rFonts w:ascii="Calibri" w:hAnsi="Calibri" w:cs="Calibri"/>
+        </w:rPr>
+      </w:pPr>
+      <w:r>
+        <w:rPr>
+          <w:rFonts w:ascii="Calibri" w:hAnsi="Calibri" w:cs="Calibri"/>
+        </w:rPr>
+        <w:t>The system was designed to support the following core functionalities required by the Fitness and Leisure Centre.</w:t>
+      </w:r>
+    </w:p>
+    <w:p>
+      <w:pPr>
+        <w:pStyle w:val="NormalWeb"/>
+        <w:rPr>
+          <w:rFonts w:ascii="Calibri" w:hAnsi="Calibri" w:cs="Calibri"/>
+        </w:rPr>
+      </w:pPr>
+      <w:r>
+        <w:rPr>
+          <w:rFonts w:ascii="Calibri" w:hAnsi="Calibri" w:cs="Calibri"/>
+        </w:rPr>
+        <w:t>First, users must be able to view the timetable of lessons. This can be done either by selecting a specific day or by searching for lessons by exercise type. This allows members to easily find available classes.</w:t>
+      </w:r>
+    </w:p>
+    <w:p>
+      <w:pPr>
+        <w:pStyle w:val="NormalWeb"/>
+        <w:rPr>
+          <w:rFonts w:ascii="Calibri" w:hAnsi="Calibri" w:cs="Calibri"/>
+        </w:rPr>
+      </w:pPr>
+      <w:r>
+        <w:rPr>
+          <w:rFonts w:ascii="Calibri" w:hAnsi="Calibri" w:cs="Calibri"/>
+        </w:rPr>
+        <w:t>Second, members must be able to book a lesson. Each lesson has a limited capacity, therefore the system ensures that a lesson cannot be booked once it is full. The system also prevents duplicate bookings so that a member cannot book the same lesson more than once.</w:t>
+      </w:r>
+    </w:p>
+    <w:p>
+      <w:pPr>
+        <w:pStyle w:val="NormalWeb"/>
+        <w:rPr>
+          <w:rFonts w:ascii="Calibri" w:hAnsi="Calibri" w:cs="Calibri"/>
+        </w:rPr>
+      </w:pPr>
+      <w:r>
+        <w:rPr>
+          <w:rFonts w:ascii="Calibri" w:hAnsi="Calibri" w:cs="Calibri"/>
+        </w:rPr>
+        <w:t>Third, the system allows members to modify existing bookings. A booking can be changed to a different lesson if the new lesson has available spaces.</w:t>
+      </w:r>
+    </w:p>
+    <w:p>
+      <w:pPr>
+        <w:pStyle w:val="NormalWeb"/>
+        <w:rPr>
+          <w:rFonts w:ascii="Calibri" w:hAnsi="Calibri" w:cs="Calibri"/>
+        </w:rPr>
+      </w:pPr>
+      <w:r>
+        <w:rPr>
+          <w:rFonts w:ascii="Calibri" w:hAnsi="Calibri" w:cs="Calibri"/>
+        </w:rPr>
+        <w:t>Fourth, bookings can also be cancelled. When a booking is cancelled, the available capacity of the lesson is updated so that other members may book it.</w:t>
+      </w:r>
+    </w:p>
+    <w:p>
+      <w:pPr>
+        <w:pStyle w:val="NormalWeb"/>
+        <w:rPr>
+          <w:rFonts w:ascii="Calibri" w:hAnsi="Calibri" w:cs="Calibri"/>
+        </w:rPr>
+      </w:pPr>
+      <w:r>
+        <w:rPr>
+          <w:rFonts w:ascii="Calibri" w:hAnsi="Calibri" w:cs="Calibri"/>
+        </w:rPr>
+        <w:t>Another important feature is lesson attendance. After attending a lesson, members can leave a rating and a short review describing their experience. This information is stored in the system and used when generating reports.</w:t>
+      </w:r>
+    </w:p>
+    <w:p>
+      <w:pPr>
+        <w:pStyle w:val="NormalWeb"/>
+        <w:rPr>
+          <w:rFonts w:ascii="Calibri" w:hAnsi="Calibri" w:cs="Calibri"/>
+        </w:rPr>
+      </w:pPr>
+      <w:r>
+        <w:rPr>
+          <w:rFonts w:ascii="Calibri" w:hAnsi="Calibri" w:cs="Calibri"/>
+        </w:rPr>
+        <w:lastRenderedPageBreak/>
+        <w:t>Finally, the system produces two types of reports. The first report shows the attendance and average rating for each lesson during a specific month. The second report identifies the exercise type that generated the highest income during that month.</w:t>
+      </w:r>
+    </w:p>
+    <w:p>
+      <w:pPr>
+        <w:pStyle w:val="Heading1"/>
+        <w:rPr>
+          <w:rFonts w:ascii="Calibri" w:hAnsi="Calibri" w:cs="Calibri"/>
+          <w:sz w:val="24"/>
+          <w:szCs w:val="24"/>
+        </w:rPr>
+      </w:pPr>
+    </w:p>
+    <w:p>
+      <w:pPr>
+        <w:pStyle w:val="Heading1"/>
+        <w:rPr>
+          <w:rFonts w:ascii="Calibri" w:hAnsi="Calibri" w:cs="Calibri"/>
+          <w:sz w:val="24"/>
+          <w:szCs w:val="24"/>
+        </w:rPr>
+      </w:pPr>
+      <w:r>
+        <w:rPr>
+          <w:rFonts w:ascii="Calibri" w:hAnsi="Calibri" w:cs="Calibri"/>
+          <w:sz w:val="24"/>
+          <w:szCs w:val="24"/>
+        </w:rPr>
+        <w:t>3. System Design</w:t>
+      </w:r>
+    </w:p>
+    <w:p>
+      <w:pPr>
+        <w:pStyle w:val="NormalWeb"/>
+        <w:rPr>
+          <w:rFonts w:ascii="Calibri" w:hAnsi="Calibri" w:cs="Calibri"/>
+        </w:rPr>
+      </w:pPr>
+      <w:r>
+        <w:rPr>
+          <w:rFonts w:ascii="Calibri" w:hAnsi="Calibri" w:cs="Calibri"/>
+        </w:rPr>
+        <w:t>The system was designed using object-oriented programming concepts such as encapsulation, abstraction and class relationships. Each important concept in the system is represented by a class.</w:t>
+      </w:r>
+    </w:p>
+    <w:p>
+      <w:pPr>
+        <w:pStyle w:val="NormalWeb"/>
+        <w:rPr>
+          <w:rFonts w:ascii="Calibri" w:hAnsi="Calibri" w:cs="Calibri"/>
+        </w:rPr>
+      </w:pPr>
+      <w:r>
+        <w:rPr>
+          <w:rFonts w:ascii="Calibri" w:hAnsi="Calibri" w:cs="Calibri"/>
+        </w:rPr>
+        <w:t xml:space="preserve">The central class of the system is </w:t>
+      </w:r>
+      <w:proofErr w:type="spellStart"/>
+      <w:r>
+        <w:rPr>
+          <w:rStyle w:val="Strong"/>
+          <w:rFonts w:ascii="Calibri" w:hAnsi="Calibri" w:cs="Calibri"/>
+        </w:rPr>
+        <w:t>FLCSystem</w:t>
+      </w:r>
+      <w:proofErr w:type="spellEnd"/>
+      <w:r>
+        <w:rPr>
+          <w:rFonts w:ascii="Calibri" w:hAnsi="Calibri" w:cs="Calibri"/>
+        </w:rPr>
+        <w:t>, which manages all the data and operations. This class stores collections of members, lessons and bookings using maps for efficient access.</w:t>
+      </w:r>
+    </w:p>
+    <w:p>
+      <w:pPr>
+        <w:pStyle w:val="NormalWeb"/>
+        <w:rPr>
+          <w:rFonts w:ascii="Calibri" w:hAnsi="Calibri" w:cs="Calibri"/>
+        </w:rPr>
+      </w:pPr>
+      <w:r>
+        <w:rPr>
+          <w:rFonts w:ascii="Calibri" w:hAnsi="Calibri" w:cs="Calibri"/>
+        </w:rPr>
+        <w:t xml:space="preserve">The </w:t>
+      </w:r>
+      <w:r>
+        <w:rPr>
+          <w:rStyle w:val="Strong"/>
+          <w:rFonts w:ascii="Calibri" w:hAnsi="Calibri" w:cs="Calibri"/>
+        </w:rPr>
+        <w:t>Member</w:t>
+      </w:r>
+      <w:r>
+        <w:rPr>
+          <w:rFonts w:ascii="Calibri" w:hAnsi="Calibri" w:cs="Calibri"/>
+        </w:rPr>
+        <w:t xml:space="preserve"> class represents a member of the fitness </w:t>
+      </w:r>
+      <w:proofErr w:type="spellStart"/>
+      <w:r>
+        <w:rPr>
+          <w:rFonts w:ascii="Calibri" w:hAnsi="Calibri" w:cs="Calibri"/>
+        </w:rPr>
+        <w:t>centre</w:t>
+      </w:r>
+      <w:proofErr w:type="spellEnd"/>
+      <w:r>
+        <w:rPr>
+          <w:rFonts w:ascii="Calibri" w:hAnsi="Calibri" w:cs="Calibri"/>
+        </w:rPr>
+        <w:t>. Each member has a unique identifier and a name.</w:t>
+      </w:r>
+    </w:p>
+    <w:p>
+      <w:pPr>
+        <w:pStyle w:val="NormalWeb"/>
+        <w:rPr>
+          <w:rFonts w:ascii="Calibri" w:hAnsi="Calibri" w:cs="Calibri"/>
+        </w:rPr>
+      </w:pPr>
+      <w:r>
+        <w:rPr>
+          <w:rFonts w:ascii="Calibri" w:hAnsi="Calibri" w:cs="Calibri"/>
+        </w:rPr>
+        <w:t xml:space="preserve">The </w:t>
+      </w:r>
+      <w:r>
+        <w:rPr>
+          <w:rStyle w:val="Strong"/>
+          <w:rFonts w:ascii="Calibri" w:hAnsi="Calibri" w:cs="Calibri"/>
+        </w:rPr>
+        <w:t>Lesson</w:t>
+      </w:r>
+      <w:r>
+        <w:rPr>
+          <w:rFonts w:ascii="Calibri" w:hAnsi="Calibri" w:cs="Calibri"/>
+        </w:rPr>
+        <w:t xml:space="preserve"> class represents a fitness lesson. A lesson contains information such as the lesson ID, weekend number, day, time slot, exercise type and price. Each lesson also has a fixed capacity which limits the number of members who can attend.</w:t>
+      </w:r>
+    </w:p>
+    <w:p>
+      <w:pPr>
+        <w:pStyle w:val="NormalWeb"/>
+        <w:rPr>
+          <w:rFonts w:ascii="Calibri" w:hAnsi="Calibri" w:cs="Calibri"/>
+        </w:rPr>
+      </w:pPr>
+      <w:r>
+        <w:rPr>
+          <w:rFonts w:ascii="Calibri" w:hAnsi="Calibri" w:cs="Calibri"/>
+        </w:rPr>
+        <w:t xml:space="preserve">The </w:t>
+      </w:r>
+      <w:r>
+        <w:rPr>
+          <w:rStyle w:val="Strong"/>
+          <w:rFonts w:ascii="Calibri" w:hAnsi="Calibri" w:cs="Calibri"/>
+        </w:rPr>
+        <w:t>Booking</w:t>
+      </w:r>
+      <w:r>
+        <w:rPr>
+          <w:rFonts w:ascii="Calibri" w:hAnsi="Calibri" w:cs="Calibri"/>
+        </w:rPr>
+        <w:t xml:space="preserve"> class represents a reservation made by a member for a particular lesson. It stores the booking ID, the member ID, the lesson ID and the booking status.</w:t>
+      </w:r>
+    </w:p>
+    <w:p>
+      <w:pPr>
+        <w:pStyle w:val="NormalWeb"/>
+        <w:rPr>
+          <w:rFonts w:ascii="Calibri" w:hAnsi="Calibri" w:cs="Calibri"/>
+        </w:rPr>
+      </w:pPr>
+      <w:r>
+        <w:rPr>
+          <w:rFonts w:ascii="Calibri" w:hAnsi="Calibri" w:cs="Calibri"/>
+        </w:rPr>
+        <w:t xml:space="preserve">The </w:t>
+      </w:r>
+      <w:r>
+        <w:rPr>
+          <w:rStyle w:val="Strong"/>
+          <w:rFonts w:ascii="Calibri" w:hAnsi="Calibri" w:cs="Calibri"/>
+        </w:rPr>
+        <w:t>Review</w:t>
+      </w:r>
+      <w:r>
+        <w:rPr>
+          <w:rFonts w:ascii="Calibri" w:hAnsi="Calibri" w:cs="Calibri"/>
+        </w:rPr>
+        <w:t xml:space="preserve"> class stores feedback provided by members after attending a lesson. A review includes a rating and a comment.</w:t>
+      </w:r>
+    </w:p>
+    <w:p>
+      <w:pPr>
+        <w:pStyle w:val="NormalWeb"/>
+        <w:rPr>
+          <w:rFonts w:ascii="Calibri" w:hAnsi="Calibri" w:cs="Calibri"/>
+        </w:rPr>
+      </w:pPr>
+      <w:r>
+        <w:rPr>
+          <w:rFonts w:ascii="Calibri" w:hAnsi="Calibri" w:cs="Calibri"/>
+        </w:rPr>
+        <w:t xml:space="preserve">To simplify the creation of initial data, a helper class called </w:t>
+      </w:r>
+      <w:proofErr w:type="spellStart"/>
+      <w:r>
+        <w:rPr>
+          <w:rStyle w:val="Strong"/>
+          <w:rFonts w:ascii="Calibri" w:hAnsi="Calibri" w:cs="Calibri"/>
+        </w:rPr>
+        <w:t>DataSeeder</w:t>
+      </w:r>
+      <w:proofErr w:type="spellEnd"/>
+      <w:r>
+        <w:rPr>
+          <w:rFonts w:ascii="Calibri" w:hAnsi="Calibri" w:cs="Calibri"/>
+        </w:rPr>
+        <w:t xml:space="preserve"> was implemented. This class generates sample members and lessons when the system starts.</w:t>
+      </w:r>
+    </w:p>
+    <w:p>
+      <w:pPr>
+        <w:pStyle w:val="NormalWeb"/>
+        <w:rPr>
+          <w:rFonts w:ascii="Calibri" w:hAnsi="Calibri" w:cs="Calibri"/>
+        </w:rPr>
+      </w:pPr>
+      <w:r>
+        <w:rPr>
+          <w:rFonts w:ascii="Calibri" w:hAnsi="Calibri" w:cs="Calibri"/>
+        </w:rPr>
+        <w:t xml:space="preserve">The system also uses enumeration types for values that have limited options. These include </w:t>
+      </w:r>
+      <w:r>
+        <w:rPr>
+          <w:rStyle w:val="Strong"/>
+          <w:rFonts w:ascii="Calibri" w:hAnsi="Calibri" w:cs="Calibri"/>
+        </w:rPr>
+        <w:t>Day</w:t>
+      </w:r>
+      <w:r>
+        <w:rPr>
+          <w:rFonts w:ascii="Calibri" w:hAnsi="Calibri" w:cs="Calibri"/>
+        </w:rPr>
+        <w:t xml:space="preserve">, </w:t>
+      </w:r>
+      <w:proofErr w:type="spellStart"/>
+      <w:r>
+        <w:rPr>
+          <w:rStyle w:val="Strong"/>
+          <w:rFonts w:ascii="Calibri" w:hAnsi="Calibri" w:cs="Calibri"/>
+        </w:rPr>
+        <w:t>TimeSlot</w:t>
+      </w:r>
+      <w:proofErr w:type="spellEnd"/>
+      <w:r>
+        <w:rPr>
+          <w:rFonts w:ascii="Calibri" w:hAnsi="Calibri" w:cs="Calibri"/>
+        </w:rPr>
+        <w:t xml:space="preserve"> and </w:t>
+      </w:r>
+      <w:proofErr w:type="spellStart"/>
+      <w:r>
+        <w:rPr>
+          <w:rStyle w:val="Strong"/>
+          <w:rFonts w:ascii="Calibri" w:hAnsi="Calibri" w:cs="Calibri"/>
+        </w:rPr>
+        <w:t>BookingStatus</w:t>
+      </w:r>
+      <w:proofErr w:type="spellEnd"/>
+      <w:r>
+        <w:rPr>
+          <w:rFonts w:ascii="Calibri" w:hAnsi="Calibri" w:cs="Calibri"/>
+        </w:rPr>
+        <w:t>. Using enumerations improves code clarity and prevents invalid values.</w:t>
+      </w:r>
+    </w:p>
+    <w:p>
+      <w:pPr>
+        <w:pStyle w:val="Heading1"/>
+        <w:rPr>
+          <w:rFonts w:ascii="Calibri" w:hAnsi="Calibri" w:cs="Calibri"/>
+          <w:sz w:val="24"/>
+          <w:szCs w:val="24"/>
+        </w:rPr>
+      </w:pPr>
       <w:bookmarkStart w:id="0" w:name="_GoBack"/>
       <w:bookmarkEnd w:id="0"/>
     </w:p>
@@ -136,104 +550,6 @@
     </w:sectPr>
   </w:body>
 </w:document>
-</file>
-
-<file path=word/numbering.xml><?xml version="1.0" encoding="utf-8"?>
-<w:numbering xmlns:wpc="http://schemas.microsoft.com/office/word/2010/wordprocessingCanvas" xmlns:cx="http://schemas.microsoft.com/office/drawing/2014/chartex" xmlns:cx1="http://schemas.microsoft.com/office/drawing/2015/9/8/chartex" xmlns:mc="http://schemas.openxmlformats.org/markup-compatibility/2006" xmlns:o="urn:schemas-microsoft-com:office:office" xmlns:r="http://schemas.openxmlformats.org/officeDocument/2006/relationships" xmlns:m="http://schemas.openxmlformats.org/officeDocument/2006/math" xmlns:v="urn:schemas-microsoft-com:vml" xmlns:wp14="http://schemas.microsoft.com/office/word/2010/wordprocessingDrawing" xmlns:wp="http://schemas.openxmlformats.org/drawingml/2006/wordprocessingDrawing" xmlns:w10="urn:schemas-microsoft-com:office:word" xmlns:w="http://schemas.openxmlformats.org/wordprocessingml/2006/main" xmlns:w14="http://schemas.microsoft.com/office/word/2010/wordml" xmlns:w15="http://schemas.microsoft.com/office/word/2012/wordml" xmlns:w16se="http://schemas.microsoft.com/office/word/2015/wordml/symex" xmlns:wpg="http://schemas.microsoft.com/office/word/2010/wordprocessingGroup" xmlns:wpi="http://schemas.microsoft.com/office/word/2010/wordprocessingInk" xmlns:wne="http://schemas.microsoft.com/office/word/2006/wordml" xmlns:wps="http://schemas.microsoft.com/office/word/2010/wordprocessingShape" mc:Ignorable="w14 w15 w16se wp14">
-  <w:abstractNum w:abstractNumId="0" w15:restartNumberingAfterBreak="0">
-    <w:nsid w:val="303100AE"/>
-    <w:multiLevelType w:val="hybridMultilevel"/>
-    <w:tmpl w:val="BDB8D2C2"/>
-    <w:lvl w:ilvl="0" w:tplc="0409000F">
-      <w:start w:val="1"/>
-      <w:numFmt w:val="decimal"/>
-      <w:lvlText w:val="%1."/>
-      <w:lvlJc w:val="left"/>
-      <w:pPr>
-        <w:ind w:left="720" w:hanging="360"/>
-      </w:pPr>
-      <w:rPr>
-        <w:rFonts w:eastAsia="Times New Roman" w:hint="default"/>
-        <w:color w:val="auto"/>
-      </w:rPr>
-    </w:lvl>
-    <w:lvl w:ilvl="1" w:tplc="04090019" w:tentative="1">
-      <w:start w:val="1"/>
-      <w:numFmt w:val="lowerLetter"/>
-      <w:lvlText w:val="%2."/>
-      <w:lvlJc w:val="left"/>
-      <w:pPr>
-        <w:ind w:left="1440" w:hanging="360"/>
-      </w:pPr>
-    </w:lvl>
-    <w:lvl w:ilvl="2" w:tplc="0409001B" w:tentative="1">
-      <w:start w:val="1"/>
-      <w:numFmt w:val="lowerRoman"/>
-      <w:lvlText w:val="%3."/>
-      <w:lvlJc w:val="right"/>
-      <w:pPr>
-        <w:ind w:left="2160" w:hanging="180"/>
-      </w:pPr>
-    </w:lvl>
-    <w:lvl w:ilvl="3" w:tplc="0409000F" w:tentative="1">
-      <w:start w:val="1"/>
-      <w:numFmt w:val="decimal"/>
-      <w:lvlText w:val="%4."/>
-      <w:lvlJc w:val="left"/>
-      <w:pPr>
-        <w:ind w:left="2880" w:hanging="360"/>
-      </w:pPr>
-    </w:lvl>
-    <w:lvl w:ilvl="4" w:tplc="04090019" w:tentative="1">
-      <w:start w:val="1"/>
-      <w:numFmt w:val="lowerLetter"/>
-      <w:lvlText w:val="%5."/>
-      <w:lvlJc w:val="left"/>
-      <w:pPr>
-        <w:ind w:left="3600" w:hanging="360"/>
-      </w:pPr>
-    </w:lvl>
-    <w:lvl w:ilvl="5" w:tplc="0409001B" w:tentative="1">
-      <w:start w:val="1"/>
-      <w:numFmt w:val="lowerRoman"/>
-      <w:lvlText w:val="%6."/>
-      <w:lvlJc w:val="right"/>
-      <w:pPr>
-        <w:ind w:left="4320" w:hanging="180"/>
-      </w:pPr>
-    </w:lvl>
-    <w:lvl w:ilvl="6" w:tplc="0409000F" w:tentative="1">
-      <w:start w:val="1"/>
-      <w:numFmt w:val="decimal"/>
-      <w:lvlText w:val="%7."/>
-      <w:lvlJc w:val="left"/>
-      <w:pPr>
-        <w:ind w:left="5040" w:hanging="360"/>
-      </w:pPr>
-    </w:lvl>
-    <w:lvl w:ilvl="7" w:tplc="04090019" w:tentative="1">
-      <w:start w:val="1"/>
-      <w:numFmt w:val="lowerLetter"/>
-      <w:lvlText w:val="%8."/>
-      <w:lvlJc w:val="left"/>
-      <w:pPr>
-        <w:ind w:left="5760" w:hanging="360"/>
-      </w:pPr>
-    </w:lvl>
-    <w:lvl w:ilvl="8" w:tplc="0409001B" w:tentative="1">
-      <w:start w:val="1"/>
-      <w:numFmt w:val="lowerRoman"/>
-      <w:lvlText w:val="%9."/>
-      <w:lvlJc w:val="right"/>
-      <w:pPr>
-        <w:ind w:left="6480" w:hanging="180"/>
-      </w:pPr>
-    </w:lvl>
-  </w:abstractNum>
-  <w:num w:numId="1">
-    <w:abstractNumId w:val="0"/>
-  </w:num>
-</w:numbering>
 </file>
 
 <file path=word/styles.xml><?xml version="1.0" encoding="utf-8"?>

</xml_diff>

<commit_message>
Summary for uml class diagram and design are updated in doc file
</commit_message>
<xml_diff>
--- a/FLC_FinalReport.docx
+++ b/FLC_FinalReport.docx
@@ -539,6 +539,180 @@
           <w:szCs w:val="24"/>
         </w:rPr>
       </w:pPr>
+    </w:p>
+    <w:p>
+      <w:pPr>
+        <w:pStyle w:val="Heading1"/>
+        <w:rPr>
+          <w:rFonts w:ascii="Calibri" w:hAnsi="Calibri" w:cs="Calibri"/>
+          <w:sz w:val="24"/>
+          <w:szCs w:val="24"/>
+        </w:rPr>
+      </w:pPr>
+      <w:r>
+        <w:rPr>
+          <w:rFonts w:ascii="Calibri" w:hAnsi="Calibri" w:cs="Calibri"/>
+          <w:sz w:val="24"/>
+          <w:szCs w:val="24"/>
+        </w:rPr>
+        <w:t>4. UML Class Diagram</w:t>
+      </w:r>
+    </w:p>
+    <w:p>
+      <w:pPr>
+        <w:pStyle w:val="NormalWeb"/>
+        <w:rPr>
+          <w:rFonts w:ascii="Calibri" w:hAnsi="Calibri" w:cs="Calibri"/>
+        </w:rPr>
+      </w:pPr>
+      <w:r>
+        <w:rPr>
+          <w:rFonts w:ascii="Calibri" w:hAnsi="Calibri" w:cs="Calibri"/>
+        </w:rPr>
+        <w:t>A UML class diagram was created to represent the structure of the system and the relationships between classes.</w:t>
+      </w:r>
+    </w:p>
+    <w:p>
+      <w:pPr>
+        <w:pStyle w:val="NormalWeb"/>
+        <w:rPr>
+          <w:rFonts w:ascii="Calibri" w:hAnsi="Calibri" w:cs="Calibri"/>
+        </w:rPr>
+      </w:pPr>
+      <w:r>
+        <w:rPr>
+          <w:rFonts w:ascii="Calibri" w:hAnsi="Calibri" w:cs="Calibri"/>
+        </w:rPr>
+        <w:t xml:space="preserve">The diagram shows the main classes including Member, Lesson, Booking, Review and </w:t>
+      </w:r>
+      <w:proofErr w:type="spellStart"/>
+      <w:r>
+        <w:rPr>
+          <w:rFonts w:ascii="Calibri" w:hAnsi="Calibri" w:cs="Calibri"/>
+        </w:rPr>
+        <w:t>FLCSystem</w:t>
+      </w:r>
+      <w:proofErr w:type="spellEnd"/>
+      <w:r>
+        <w:rPr>
+          <w:rFonts w:ascii="Calibri" w:hAnsi="Calibri" w:cs="Calibri"/>
+        </w:rPr>
+        <w:t>. It also illustrates how these classes interact with each other.</w:t>
+      </w:r>
+    </w:p>
+    <w:p>
+      <w:pPr>
+        <w:pStyle w:val="NormalWeb"/>
+        <w:rPr>
+          <w:rFonts w:ascii="Calibri" w:hAnsi="Calibri" w:cs="Calibri"/>
+        </w:rPr>
+      </w:pPr>
+      <w:r>
+        <w:rPr>
+          <w:rFonts w:ascii="Calibri" w:hAnsi="Calibri" w:cs="Calibri"/>
+        </w:rPr>
+        <w:lastRenderedPageBreak/>
+        <w:t>A member can have multiple bookings, while each booking belongs to a single member. Similarly, a lesson can have multiple bookings, but each booking refers to only one lesson. Lessons may also have multiple reviews provided by members after attending.</w:t>
+      </w:r>
+    </w:p>
+    <w:p>
+      <w:pPr>
+        <w:pStyle w:val="NormalWeb"/>
+        <w:rPr>
+          <w:rFonts w:ascii="Calibri" w:hAnsi="Calibri" w:cs="Calibri"/>
+        </w:rPr>
+      </w:pPr>
+      <w:r>
+        <w:rPr>
+          <w:rFonts w:ascii="Calibri" w:hAnsi="Calibri" w:cs="Calibri"/>
+        </w:rPr>
+        <w:t xml:space="preserve">The </w:t>
+      </w:r>
+      <w:proofErr w:type="spellStart"/>
+      <w:r>
+        <w:rPr>
+          <w:rFonts w:ascii="Calibri" w:hAnsi="Calibri" w:cs="Calibri"/>
+        </w:rPr>
+        <w:t>FLCSystem</w:t>
+      </w:r>
+      <w:proofErr w:type="spellEnd"/>
+      <w:r>
+        <w:rPr>
+          <w:rFonts w:ascii="Calibri" w:hAnsi="Calibri" w:cs="Calibri"/>
+        </w:rPr>
+        <w:t xml:space="preserve"> class manages collections of members, lessons and bookings, acting as the central controller of the system.</w:t>
+      </w:r>
+    </w:p>
+    <w:p>
+      <w:pPr>
+        <w:pStyle w:val="NormalWeb"/>
+        <w:rPr>
+          <w:rFonts w:ascii="Calibri" w:hAnsi="Calibri" w:cs="Calibri"/>
+        </w:rPr>
+      </w:pPr>
+      <w:r>
+        <w:rPr>
+          <w:rFonts w:ascii="Calibri" w:hAnsi="Calibri" w:cs="Calibri"/>
+        </w:rPr>
+        <w:t>The UML diagram helps visualize the design of the application and ensures that the relationships between classes are clearly defined before implementation.</w:t>
+      </w:r>
+    </w:p>
+    <w:p>
+      <w:pPr>
+        <w:pStyle w:val="NormalWeb"/>
+        <w:rPr>
+          <w:rFonts w:ascii="Calibri" w:hAnsi="Calibri" w:cs="Calibri"/>
+        </w:rPr>
+      </w:pPr>
+      <w:r>
+        <w:rPr>
+          <w:rFonts w:ascii="Calibri" w:hAnsi="Calibri" w:cs="Calibri"/>
+          <w:noProof/>
+        </w:rPr>
+        <w:drawing>
+          <wp:inline distT="0" distB="0" distL="0" distR="0">
+            <wp:extent cx="5725656" cy="5120640"/>
+            <wp:effectExtent l="0" t="0" r="8890" b="3810"/>
+            <wp:docPr id="1" name="Picture 1"/>
+            <wp:cNvGraphicFramePr>
+              <a:graphicFrameLocks xmlns:a="http://schemas.openxmlformats.org/drawingml/2006/main" noChangeAspect="1"/>
+            </wp:cNvGraphicFramePr>
+            <a:graphic xmlns:a="http://schemas.openxmlformats.org/drawingml/2006/main">
+              <a:graphicData uri="http://schemas.openxmlformats.org/drawingml/2006/picture">
+                <pic:pic xmlns:pic="http://schemas.openxmlformats.org/drawingml/2006/picture">
+                  <pic:nvPicPr>
+                    <pic:cNvPr id="1" name="CourseWorkUML.drawio.png"/>
+                    <pic:cNvPicPr/>
+                  </pic:nvPicPr>
+                  <pic:blipFill>
+                    <a:blip r:embed="rId4">
+                      <a:extLst>
+                        <a:ext uri="{28A0092B-C50C-407E-A947-70E740481C1C}">
+                          <a14:useLocalDpi xmlns:a14="http://schemas.microsoft.com/office/drawing/2010/main" val="0"/>
+                        </a:ext>
+                      </a:extLst>
+                    </a:blip>
+                    <a:stretch>
+                      <a:fillRect/>
+                    </a:stretch>
+                  </pic:blipFill>
+                  <pic:spPr>
+                    <a:xfrm>
+                      <a:off x="0" y="0"/>
+                      <a:ext cx="5725656" cy="5120640"/>
+                    </a:xfrm>
+                    <a:prstGeom prst="rect">
+                      <a:avLst/>
+                    </a:prstGeom>
+                  </pic:spPr>
+                </pic:pic>
+              </a:graphicData>
+            </a:graphic>
+          </wp:inline>
+        </w:drawing>
+      </w:r>
+    </w:p>
+    <w:p>
       <w:bookmarkStart w:id="0" w:name="_GoBack"/>
       <w:bookmarkEnd w:id="0"/>
     </w:p>

</xml_diff>

<commit_message>
Implementation details summary added in file
</commit_message>
<xml_diff>
--- a/FLC_FinalReport.docx
+++ b/FLC_FinalReport.docx
@@ -711,6 +711,147 @@
           </wp:inline>
         </w:drawing>
       </w:r>
+    </w:p>
+    <w:p>
+      <w:pPr>
+        <w:pStyle w:val="Heading1"/>
+        <w:rPr>
+          <w:rFonts w:ascii="Calibri" w:hAnsi="Calibri" w:cs="Calibri"/>
+          <w:sz w:val="24"/>
+          <w:szCs w:val="24"/>
+        </w:rPr>
+      </w:pPr>
+      <w:r>
+        <w:rPr>
+          <w:rFonts w:ascii="Calibri" w:hAnsi="Calibri" w:cs="Calibri"/>
+          <w:sz w:val="24"/>
+          <w:szCs w:val="24"/>
+        </w:rPr>
+        <w:t>5. Implementation</w:t>
+      </w:r>
+    </w:p>
+    <w:p>
+      <w:pPr>
+        <w:pStyle w:val="NormalWeb"/>
+        <w:rPr>
+          <w:rFonts w:ascii="Calibri" w:hAnsi="Calibri" w:cs="Calibri"/>
+        </w:rPr>
+      </w:pPr>
+      <w:r>
+        <w:rPr>
+          <w:rFonts w:ascii="Calibri" w:hAnsi="Calibri" w:cs="Calibri"/>
+        </w:rPr>
+        <w:t>The system was implemented using Java and developed using the IntelliJ IDEA development environment. The project was structured as a Maven project, which allows dependencies and build processes to be managed easily.</w:t>
+      </w:r>
+    </w:p>
+    <w:p>
+      <w:pPr>
+        <w:pStyle w:val="NormalWeb"/>
+        <w:rPr>
+          <w:rFonts w:ascii="Calibri" w:hAnsi="Calibri" w:cs="Calibri"/>
+        </w:rPr>
+      </w:pPr>
+      <w:r>
+        <w:rPr>
+          <w:rFonts w:ascii="Calibri" w:hAnsi="Calibri" w:cs="Calibri"/>
+        </w:rPr>
+        <w:t>The implementation follows a modular structure where different responsibilities are assigned to different classes.</w:t>
+      </w:r>
+    </w:p>
+    <w:p>
+      <w:pPr>
+        <w:pStyle w:val="NormalWeb"/>
+        <w:rPr>
+          <w:rFonts w:ascii="Calibri" w:hAnsi="Calibri" w:cs="Calibri"/>
+        </w:rPr>
+      </w:pPr>
+      <w:r>
+        <w:rPr>
+          <w:rFonts w:ascii="Calibri" w:hAnsi="Calibri" w:cs="Calibri"/>
+        </w:rPr>
+        <w:lastRenderedPageBreak/>
+        <w:t>The Member class contains simple attributes and methods to access member information. The Lesson class manages lesson details and maintains a list of members who have booked the lesson. It also contains logic to determine whether the lesson is full.</w:t>
+      </w:r>
+    </w:p>
+    <w:p>
+      <w:pPr>
+        <w:pStyle w:val="NormalWeb"/>
+        <w:rPr>
+          <w:rFonts w:ascii="Calibri" w:hAnsi="Calibri" w:cs="Calibri"/>
+        </w:rPr>
+      </w:pPr>
+      <w:r>
+        <w:rPr>
+          <w:rFonts w:ascii="Calibri" w:hAnsi="Calibri" w:cs="Calibri"/>
+        </w:rPr>
+        <w:t>The Booking class represents the connection between a member and a lesson. Methods were implemented to allow bookings to be cancelled, changed or marked as attended.</w:t>
+      </w:r>
+    </w:p>
+    <w:p>
+      <w:pPr>
+        <w:pStyle w:val="NormalWeb"/>
+        <w:rPr>
+          <w:rFonts w:ascii="Calibri" w:hAnsi="Calibri" w:cs="Calibri"/>
+        </w:rPr>
+      </w:pPr>
+      <w:r>
+        <w:rPr>
+          <w:rFonts w:ascii="Calibri" w:hAnsi="Calibri" w:cs="Calibri"/>
+        </w:rPr>
+        <w:t>The Review class stores feedback information provided by members, including a rating and optional comments.</w:t>
+      </w:r>
+    </w:p>
+    <w:p>
+      <w:pPr>
+        <w:pStyle w:val="NormalWeb"/>
+        <w:rPr>
+          <w:rFonts w:ascii="Calibri" w:hAnsi="Calibri" w:cs="Calibri"/>
+        </w:rPr>
+      </w:pPr>
+      <w:r>
+        <w:rPr>
+          <w:rFonts w:ascii="Calibri" w:hAnsi="Calibri" w:cs="Calibri"/>
+        </w:rPr>
+        <w:t xml:space="preserve">The main system logic is contained in the </w:t>
+      </w:r>
+      <w:proofErr w:type="spellStart"/>
+      <w:r>
+        <w:rPr>
+          <w:rFonts w:ascii="Calibri" w:hAnsi="Calibri" w:cs="Calibri"/>
+        </w:rPr>
+        <w:t>FLCSystem</w:t>
+      </w:r>
+      <w:proofErr w:type="spellEnd"/>
+      <w:r>
+        <w:rPr>
+          <w:rFonts w:ascii="Calibri" w:hAnsi="Calibri" w:cs="Calibri"/>
+        </w:rPr>
+        <w:t xml:space="preserve"> class. This class provides methods for booking lessons, changing bookings, cancelling bookings, marking attendance and generating reports.</w:t>
+      </w:r>
+    </w:p>
+    <w:p>
+      <w:pPr>
+        <w:pStyle w:val="NormalWeb"/>
+        <w:rPr>
+          <w:rFonts w:ascii="Calibri" w:hAnsi="Calibri" w:cs="Calibri"/>
+        </w:rPr>
+      </w:pPr>
+      <w:r>
+        <w:rPr>
+          <w:rFonts w:ascii="Calibri" w:hAnsi="Calibri" w:cs="Calibri"/>
+        </w:rPr>
+        <w:t>The application is executed through a simple console menu interface which allows the user to choose different operations.</w:t>
+      </w:r>
+    </w:p>
+    <w:p>
+      <w:pPr>
+        <w:pStyle w:val="Heading1"/>
+        <w:rPr>
+          <w:rFonts w:ascii="Calibri" w:hAnsi="Calibri" w:cs="Calibri"/>
+          <w:sz w:val="24"/>
+          <w:szCs w:val="24"/>
+        </w:rPr>
+      </w:pPr>
     </w:p>
     <w:p>
       <w:bookmarkStart w:id="0" w:name="_GoBack"/>

</xml_diff>

<commit_message>
added docs file with testing summary
</commit_message>
<xml_diff>
--- a/FLC_FinalReport.docx
+++ b/FLC_FinalReport.docx
@@ -852,6 +852,121 @@
           <w:szCs w:val="24"/>
         </w:rPr>
       </w:pPr>
+    </w:p>
+    <w:p>
+      <w:pPr>
+        <w:pStyle w:val="Heading1"/>
+        <w:rPr>
+          <w:rFonts w:ascii="Calibri" w:hAnsi="Calibri" w:cs="Calibri"/>
+          <w:sz w:val="24"/>
+          <w:szCs w:val="24"/>
+        </w:rPr>
+      </w:pPr>
+      <w:r>
+        <w:rPr>
+          <w:rFonts w:ascii="Calibri" w:hAnsi="Calibri" w:cs="Calibri"/>
+          <w:sz w:val="24"/>
+          <w:szCs w:val="24"/>
+        </w:rPr>
+        <w:t>6. Testing</w:t>
+      </w:r>
+    </w:p>
+    <w:p>
+      <w:pPr>
+        <w:pStyle w:val="NormalWeb"/>
+        <w:rPr>
+          <w:rFonts w:ascii="Calibri" w:hAnsi="Calibri" w:cs="Calibri"/>
+        </w:rPr>
+      </w:pPr>
+      <w:r>
+        <w:rPr>
+          <w:rFonts w:ascii="Calibri" w:hAnsi="Calibri" w:cs="Calibri"/>
+        </w:rPr>
+        <w:t>Testing was an important part of the development process to ensure that the system functions correctly.</w:t>
+      </w:r>
+    </w:p>
+    <w:p>
+      <w:pPr>
+        <w:pStyle w:val="NormalWeb"/>
+        <w:rPr>
+          <w:rFonts w:ascii="Calibri" w:hAnsi="Calibri" w:cs="Calibri"/>
+        </w:rPr>
+      </w:pPr>
+      <w:r>
+        <w:rPr>
+          <w:rFonts w:ascii="Calibri" w:hAnsi="Calibri" w:cs="Calibri"/>
+        </w:rPr>
+        <w:t xml:space="preserve">Unit testing was implemented using </w:t>
+      </w:r>
+      <w:r>
+        <w:rPr>
+          <w:rStyle w:val="Strong"/>
+          <w:rFonts w:ascii="Calibri" w:hAnsi="Calibri" w:cs="Calibri"/>
+        </w:rPr>
+        <w:t>JUnit 5</w:t>
+      </w:r>
+      <w:r>
+        <w:rPr>
+          <w:rFonts w:ascii="Calibri" w:hAnsi="Calibri" w:cs="Calibri"/>
+        </w:rPr>
+        <w:t xml:space="preserve">. Several test cases were written to verify the </w:t>
+      </w:r>
+      <w:proofErr w:type="spellStart"/>
+      <w:r>
+        <w:rPr>
+          <w:rFonts w:ascii="Calibri" w:hAnsi="Calibri" w:cs="Calibri"/>
+        </w:rPr>
+        <w:t>behaviour</w:t>
+      </w:r>
+      <w:proofErr w:type="spellEnd"/>
+      <w:r>
+        <w:rPr>
+          <w:rFonts w:ascii="Calibri" w:hAnsi="Calibri" w:cs="Calibri"/>
+        </w:rPr>
+        <w:t xml:space="preserve"> of the booking system.</w:t>
+      </w:r>
+    </w:p>
+    <w:p>
+      <w:pPr>
+        <w:pStyle w:val="NormalWeb"/>
+        <w:rPr>
+          <w:rFonts w:ascii="Calibri" w:hAnsi="Calibri" w:cs="Calibri"/>
+        </w:rPr>
+      </w:pPr>
+      <w:r>
+        <w:rPr>
+          <w:rFonts w:ascii="Calibri" w:hAnsi="Calibri" w:cs="Calibri"/>
+        </w:rPr>
+        <w:t>For example, one test checks that a lesson can be successfully booked when space is available. Another test verifies that duplicate bookings are not allowed for the same member and lesson.</w:t>
+      </w:r>
+    </w:p>
+    <w:p>
+      <w:pPr>
+        <w:pStyle w:val="NormalWeb"/>
+        <w:rPr>
+          <w:rFonts w:ascii="Calibri" w:hAnsi="Calibri" w:cs="Calibri"/>
+        </w:rPr>
+      </w:pPr>
+      <w:r>
+        <w:rPr>
+          <w:rFonts w:ascii="Calibri" w:hAnsi="Calibri" w:cs="Calibri"/>
+        </w:rPr>
+        <w:t>Additional tests ensure that the lesson capacity limit is enforced and that a fifth booking cannot be made when the lesson capacity is four. Tests were also created to verify booking cancellation and lesson attendance functionality.</w:t>
+      </w:r>
+    </w:p>
+    <w:p>
+      <w:pPr>
+        <w:pStyle w:val="NormalWeb"/>
+        <w:rPr>
+          <w:rFonts w:ascii="Calibri" w:hAnsi="Calibri" w:cs="Calibri"/>
+        </w:rPr>
+      </w:pPr>
+      <w:r>
+        <w:rPr>
+          <w:rFonts w:ascii="Calibri" w:hAnsi="Calibri" w:cs="Calibri"/>
+        </w:rPr>
+        <w:t>These tests help confirm that the system behaves as expected and that important constraints such as capacity limits and duplicate bookings are properly handled.</w:t>
+      </w:r>
     </w:p>
     <w:p>
       <w:bookmarkStart w:id="0" w:name="_GoBack"/>

</xml_diff>